<commit_message>
Week 14: logout step present, support page pending, system named L-SIAMS
Co-Authored-By: Claude Opus 5.5 <noreply@anthropic.com>
Claude-Session: https://claude.ai/code/session_01STNXvDgsLh1vFKuFkJaJNo
</commit_message>
<xml_diff>
--- a/docs/activities/WEEK_14_answered.docx
+++ b/docs/activities/WEEK_14_answered.docx
@@ -12571,6 +12571,18 @@
     </w:p>
     <w:p>
       <w:pPr>
+        <w:spacing w:after="120"/>
+        <w:jc w:val="both"/>
+      </w:pPr>
+      <w:r>
+        <w:rPr>
+          <w:rFonts w:ascii="Times New Roman" w:hAnsi="Times New Roman" w:cs="Times New Roman"/>
+        </w:rPr>
+        <w:t xml:space="preserve">4. The user manual has no Support/contact page yet; it will be added.</w:t>
+      </w:r>
+    </w:p>
+    <w:p>
+      <w:pPr>
         <w:spacing w:after="0" w:line="240" w:lineRule="auto"/>
         <w:contextualSpacing/>
         <w:rPr>
@@ -12642,7 +12654,7 @@
         <w:rPr>
           <w:rFonts w:ascii="Times New Roman" w:hAnsi="Times New Roman" w:cs="Times New Roman"/>
         </w:rPr>
-        <w:t xml:space="preserve">1. Assign a release number (for example, L-SIAMS-Lite 1.0, October 2026) and add a short change log to the README.</w:t>
+        <w:t xml:space="preserve">1. Add a version number to the system name (for example, L-SIAMS 1.0, October 2026) and a short change log to the README.</w:t>
       </w:r>
     </w:p>
     <w:p>
@@ -12677,10 +12689,22 @@
       <w:r>
         <w:rPr>
           <w:rFonts w:ascii="Times New Roman" w:hAnsi="Times New Roman" w:cs="Times New Roman"/>
+        </w:rPr>
+        <w:t xml:space="preserve">4. Add the Support/contact page to the user manual.</w:t>
+      </w:r>
+    </w:p>
+    <w:p>
+      <w:pPr>
+        <w:spacing w:after="120"/>
+        <w:jc w:val="both"/>
+      </w:pPr>
+      <w:r>
+        <w:rPr>
+          <w:rFonts w:ascii="Times New Roman" w:hAnsi="Times New Roman" w:cs="Times New Roman"/>
           <w:i/>
           <w:iCs/>
         </w:rPr>
-        <w:t xml:space="preserve">Sources of the existing documentation: README.md; docs/DEPLOYMENT.md, RUNNING-ON-WINDOWS.md, NETWORK-ACCESS.md, HTTPS.md, SECURITY.md, API.md, FIRMWARE.md, MOVING-TO-ANOTHER-PC.md and MIGRATING-FROM-MARIADB.md in the L-SIAMS-Lite repository; manuscript Chapter IV (architecture, ERD, security) and Sections 3.2.1, 3.5 and 5.6.</w:t>
+        <w:t xml:space="preserve">Sources of the existing documentation: README.md; docs/DEPLOYMENT.md, RUNNING-ON-WINDOWS.md, NETWORK-ACCESS.md, HTTPS.md, SECURITY.md, API.md, FIRMWARE.md, MOVING-TO-ANOTHER-PC.md and MIGRATING-FROM-MARIADB.md in the L-SIAMS repository; manuscript Chapter IV (architecture, ERD, security) and Sections 3.2.1, 3.5 and 5.6.</w:t>
       </w:r>
     </w:p>
     <w:p>
@@ -13042,7 +13066,7 @@
           <w:b/>
           <w:bCs/>
         </w:rPr>
-        <w:t xml:space="preserve">System Name: L-SIAMS-Lite (Local IoT-Based Multi-Layer Secured Attendance Monitoring System)</w:t>
+        <w:t xml:space="preserve">System Name: L-SIAMS (Local IoT-Based Multi-Layer Secured Attendance Monitoring System)</w:t>
       </w:r>
       <w:r>
         <w:rPr>
@@ -14036,7 +14060,7 @@
               <w:rPr>
                 <w:rFonts w:ascii="Segoe UI Symbol" w:hAnsi="Segoe UI Symbol" w:cs="Segoe UI Symbol"/>
               </w:rPr>
-              <w:t>☐</w:t>
+              <w:t>☒</w:t>
             </w:r>
           </w:p>
         </w:tc>

</xml_diff>